<commit_message>
kielenhuolto Matin äänellä + osaamistavoite- ja tiimikonteksti-alkuosiot kaikkiin webnäyttöprojekteihin
Co-Authored-By: Claude Fable 5 <noreply@anthropic.com>
Claude-Session: https://claude.ai/code/session_01WLu7m3NNTZnXJVQ9kuPvzX
</commit_message>
<xml_diff>
--- a/noppakauppa/downloads/nayttosuunnitelma.docx
+++ b/noppakauppa/downloads/nayttosuunnitelma.docx
@@ -928,7 +928,7 @@
                 <w:sz w:val="19"/>
                 <w:szCs w:val="19"/>
               </w:rPr>
-              <w:t xml:space="preserve">Featurelista päättyy</w:t>
+              <w:t xml:space="preserve">Ominaisuuslista päättyy</w:t>
             </w:r>
           </w:p>
         </w:tc>
@@ -1093,7 +1093,7 @@
                 <w:sz w:val="19"/>
                 <w:szCs w:val="19"/>
               </w:rPr>
-              <w:t xml:space="preserve">v1.0-rc1 on tagattu, repo siivottu ja ulkopuolinen on tehnyt testitilauksen pelkän ohjeen avulla puhtaassa ympäristössä.</w:t>
+              <w:t xml:space="preserve">Tagi v1.0-rc1 on merkitty, repo on siivottu ja ulkopuolinen on tehnyt testitilauksen pelkän ohjeen avulla puhtaassa ympäristössä.</w:t>
             </w:r>
           </w:p>
         </w:tc>
@@ -4444,7 +4444,7 @@
           <w:sz w:val="20"/>
           <w:szCs w:val="20"/>
         </w:rPr>
-        <w:t xml:space="preserve">Featurelistan päättyminen sanotaan opiskelijalle ääneen viikon 13 kortissa. Jos uusia ominaisuuksia ilmaantuu viikoilla 14–17, rajaus on pettänyt ja se on syytä ottaa puheeksi.</w:t>
+        <w:t xml:space="preserve">Ominaisuuslistan päättyminen sanotaan opiskelijalle ääneen viikon 13 kortissa. Jos uusia ominaisuuksia ilmaantuu viikoilla 14–17, rajaus on pettänyt ja se on syytä ottaa puheeksi.</w:t>
       </w:r>
     </w:p>
     <w:p>

</xml_diff>

<commit_message>
ajatusviivat suomen käytännön mukaisiksi, suunnitelmalomakkeen plan-fields-ruudukko, SVG-otsikkopalkin korkeus
Co-Authored-By: Claude Fable 5 <noreply@anthropic.com>
Claude-Session: https://claude.ai/code/session_01WLu7m3NNTZnXJVQ9kuPvzX
</commit_message>
<xml_diff>
--- a/noppakauppa/downloads/nayttosuunnitelma.docx
+++ b/noppakauppa/downloads/nayttosuunnitelma.docx
@@ -115,7 +115,7 @@
           <w:sz w:val="21"/>
           <w:szCs w:val="21"/>
         </w:rPr>
-        <w:t xml:space="preserve">Pakollinen perusversio (P0): tuotteet kategorioittain, sanahaku, ostoskori, rekisteröityminen ja kirjautuminen, tilaus, tilaushistoria, omien tietojen muokkaus, tuotehallinta ja tilausten selaus. Maksunvälitys on rajattu pois asiakkaan päätöksellä — sitä ei toteuteta osittainkaan.</w:t>
+        <w:t xml:space="preserve">Pakollinen perusversio (P0): tuotteet kategorioittain, sanahaku, ostoskori, rekisteröityminen ja kirjautuminen, tilaus, tilaushistoria, omien tietojen muokkaus, tuotehallinta ja tilausten selaus. Maksunvälitys on rajattu pois asiakkaan päätöksellä. Sitä ei toteuteta osittainkaan.</w:t>
       </w:r>
     </w:p>
     <w:p>
@@ -296,7 +296,7 @@
                 <w:sz w:val="19"/>
                 <w:szCs w:val="19"/>
               </w:rPr>
-              <w:t xml:space="preserve">Nimetty ulkopuolinen henkilö — toinen opiskelija, työpaikkaohjaaja tai muu sovittu — ei oma ohjaaja. Kokeilee julkaistua kauppaa tehtäväradalla ja antaa palautteen omin sanoin.</w:t>
+              <w:t xml:space="preserve">Nimetty ulkopuolinen henkilö (toinen opiskelija, työpaikkaohjaaja tai muu sovittu), ei oma ohjaaja. Kokeilee julkaistua kauppaa tehtäväradalla ja antaa palautteen omin sanoin.</w:t>
             </w:r>
           </w:p>
         </w:tc>
@@ -1602,7 +1602,7 @@
                 <w:sz w:val="19"/>
                 <w:szCs w:val="19"/>
               </w:rPr>
-              <w:t xml:space="preserve">Tilauslogiikka jaettuna moduuleihin ja funktioihin (reitit, kantakerros, validointi); frontissa komponentti- ja store-jako — ei yhtä jättitiedostoa</w:t>
+              <w:t xml:space="preserve">Tilauslogiikka jaettuna moduuleihin ja funktioihin (reitit, kantakerros, validointi); frontissa komponentti- ja store-jako, ei yhtä jättitiedostoa</w:t>
             </w:r>
           </w:p>
         </w:tc>
@@ -1675,7 +1675,7 @@
                 <w:sz w:val="19"/>
                 <w:szCs w:val="19"/>
               </w:rPr>
-              <w:t xml:space="preserve">Refaktorointicommitit perusteluineen: nimeäminen, toisteisuuden poisto, komponentin pilkkominen — testit vihreinä ennen ja jälkeen</w:t>
+              <w:t xml:space="preserve">Refaktorointicommitit perusteluineen: nimeäminen, toisteisuuden poisto, komponentin pilkkominen; testit vihreinä ennen ja jälkeen</w:t>
             </w:r>
           </w:p>
         </w:tc>
@@ -2040,7 +2040,7 @@
                 <w:sz w:val="19"/>
                 <w:szCs w:val="19"/>
               </w:rPr>
-              <w:t xml:space="preserve">Asiakaskatselmoinnin muistio: täyttääkö toteutus tarinat, mitä muutetaan ennen seuraavaa versiota — priorisoitu ohjaajan kanssa</w:t>
+              <w:t xml:space="preserve">Asiakaskatselmoinnin muistio: täyttääkö toteutus tarinat, mitä muutetaan ennen seuraavaa versiota; priorisoitu ohjaajan kanssa</w:t>
             </w:r>
           </w:p>
         </w:tc>
@@ -2386,7 +2386,7 @@
                 <w:sz w:val="19"/>
                 <w:szCs w:val="19"/>
               </w:rPr>
-              <w:t xml:space="preserve">Katselmoinnin asiakaskielinen yhteenveto ja viikon 17 luovutusviesti — ilman teknistä jargonia; maksurajauksen selitys asiakkaalle</w:t>
+              <w:t xml:space="preserve">Katselmoinnin asiakaskielinen yhteenveto ja viikon 17 luovutusviesti, ilman teknistä jargonia; maksurajauksen selitys asiakkaalle</w:t>
             </w:r>
           </w:p>
         </w:tc>
@@ -2459,7 +2459,7 @@
                 <w:sz w:val="19"/>
                 <w:szCs w:val="19"/>
               </w:rPr>
-              <w:t xml:space="preserve">Kaksi katselmointia: asiakaskatselmointi puolivälissä ja RC:n julkaisutestaus — muistiot rooleineen ja sitaatteineen</w:t>
+              <w:t xml:space="preserve">Kaksi katselmointia: asiakaskatselmointi puolivälissä ja RC:n julkaisutestaus; muistiot rooleineen ja sitaatteineen</w:t>
             </w:r>
           </w:p>
         </w:tc>
@@ -3681,7 +3681,7 @@
                 <w:sz w:val="19"/>
                 <w:szCs w:val="19"/>
               </w:rPr>
-              <w:t xml:space="preserve">vue-router perusteltuna (reititys) ja yksi oma perusteltu lisäpaketti (esim. vee-validate) — käyttötarkoitus, konfigurointi ja riippuvuusvaikutus kirjattu</w:t>
+              <w:t xml:space="preserve">vue-router perusteltuna (reititys) ja yksi oma perusteltu lisäpaketti (esim. vee-validate); käyttötarkoitus, konfigurointi ja riippuvuusvaikutus kirjattu</w:t>
             </w:r>
           </w:p>
         </w:tc>
@@ -3900,7 +3900,7 @@
                 <w:sz w:val="19"/>
                 <w:szCs w:val="19"/>
               </w:rPr>
-              <w:t xml:space="preserve">README: käyttöönotto, käynnistys, riippuvuudet, ympäristöasetukset, tunnetut puutteet — ulkopuolisen julkaisutestillä todennettu ohje</w:t>
+              <w:t xml:space="preserve">README: käyttöönotto, käynnistys, riippuvuudet, ympäristöasetukset, tunnetut puutteet; ulkopuolisen julkaisutestillä todennettu ohje</w:t>
             </w:r>
           </w:p>
         </w:tc>
@@ -4120,7 +4120,7 @@
           <w:sz w:val="21"/>
           <w:szCs w:val="21"/>
         </w:rPr>
-        <w:t xml:space="preserve">Itse tehtävä ydin: komponenttirakenne, saavutettavuusratkaisut ja CSS. Tietoturvaratkaisut — salasanakäsittely, istunnot ja roolitarkistukset — pitää ymmärtää ja perustella itse. Viikon 3 tuotelistanäkymä rakennetaan kokonaan itse ilman valmista UI-komponenttikirjastoa.</w:t>
+        <w:t xml:space="preserve">Itse tehtävä ydin: komponenttirakenne, saavutettavuusratkaisut ja CSS. Tietoturvaratkaisut (salasanakäsittely, istunnot ja roolitarkistukset) pitää ymmärtää ja perustella itse. Viikon 3 tuotelistanäkymä rakennetaan kokonaan itse ilman valmista UI-komponenttikirjastoa.</w:t>
       </w:r>
     </w:p>
     <w:p>

</xml_diff>

<commit_message>
layoutuudistus: kaksipalstainen sovellusrakenne (sivupalkki + näkymät) kolmeen webnäyttöprojektiin, uudet koontikuvat
Co-Authored-By: Claude Fable 5 <noreply@anthropic.com>
Claude-Session: https://claude.ai/code/session_01WLu7m3NNTZnXJVQ9kuPvzX
</commit_message>
<xml_diff>
--- a/noppakauppa/downloads/nayttosuunnitelma.docx
+++ b/noppakauppa/downloads/nayttosuunnitelma.docx
@@ -1212,7 +1212,7 @@
           <w:bCs/>
           <w:color w:val="9a3412"/>
         </w:rPr>
-        <w:t xml:space="preserve">Ohjelmointi · 11 vaatimusta</w:t>
+        <w:t xml:space="preserve">Ohjelmointi</w:t>
       </w:r>
     </w:p>
     <w:tbl>
@@ -2142,7 +2142,7 @@
           <w:bCs/>
           <w:color w:val="9a3412"/>
         </w:rPr>
-        <w:t xml:space="preserve">Ohjelmistokehittäjänä toimiminen · 14 vaatimusta</w:t>
+        <w:t xml:space="preserve">Ohjelmistokehittäjänä toimiminen</w:t>
       </w:r>
     </w:p>
     <w:tbl>
@@ -3291,7 +3291,7 @@
           <w:bCs/>
           <w:color w:val="9a3412"/>
         </w:rPr>
-        <w:t xml:space="preserve">Ohjelmiston toteuttaminen ohjelmistokomponenttikirjastolla · 7 vaatimusta</w:t>
+        <w:t xml:space="preserve">Ohjelmiston toteuttaminen ohjelmistokomponenttikirjastolla</w:t>
       </w:r>
     </w:p>
     <w:tbl>

</xml_diff>